<commit_message>
Portal notes: users cannot change cores or memory, so advise only user options
Co-Authored-By: Claude Opus 5.5 <noreply@anthropic.com>
</commit_message>
<xml_diff>
--- a/docs/Spatial_Transcriptomics_Visium_Pipeline/pipeline/Portal_Content.docx
+++ b/docs/Spatial_Transcriptomics_Visium_Pipeline/pipeline/Portal_Content.docx
@@ -2049,7 +2049,7 @@
         <w:t xml:space="preserve">슬라이스가 많을수록 통합 단계의 메모리가 늘어납니다.</w:t>
       </w:r>
       <w:r>
-        <w:t xml:space="preserve"> 통합 단계(spatial_merge)는 64GB를 권장하며, 슬라이스가 아주 많으면 128GB로 올려 주세요. 단일세포 참조가 크면(수만 세포 이상) spatial_labelTransfer에 128GB를 권장합니다.</w:t>
+        <w:t xml:space="preserve"> 슬라이스가 아주 많아 통합 단계(spatial_merge)가 메모리 부족으로 멈추면 슬라이스를 나눠 통합해 주세요. 단일세포 참조가 크면(수만 세포 이상) 세포 유형별로 세포 수를 줄인 참조를 쓰면 메모리가 줄어듭니다.</w:t>
       </w:r>
     </w:p>
     <w:p>
@@ -2245,7 +2245,7 @@
         <w:t xml:space="preserve">Memory of the integration step grows with the number of slices.</w:t>
       </w:r>
       <w:r>
-        <w:t xml:space="preserve"> 64 GB is recommended for the integration step (spatial_merge), and 128 GB for very many slices. With a large single-cell reference (tens of thousands of cells or more), 128 GB is recommended for spatial_labelTransfer.</w:t>
+        <w:t xml:space="preserve"> If the integration step (spatial_merge) stops for lack of memory with very many slices, integrate the slices in smaller sets. With a large single-cell reference (tens of thousands of cells or more), a reference subsampled per cell type uses less memory.</w:t>
       </w:r>
     </w:p>
     <w:p>

</xml_diff>